<commit_message>
crisp-dm 05_Evaluation y evidencias scrum
se cargo 05_Evaluation
</commit_message>
<xml_diff>
--- a/Fase 2/Evidencias Extra/SCRUM_FERREDASH/Sprint_2/1 - Cheklist para Sprint 2.docx
+++ b/Fase 2/Evidencias Extra/SCRUM_FERREDASH/Sprint_2/1 - Cheklist para Sprint 2.docx
@@ -142,7 +142,17 @@
           <w:szCs w:val="48"/>
           <w:lang w:val="en-US"/>
         </w:rPr>
-        <w:t>Check List previo a Sprint 1</w:t>
+        <w:t xml:space="preserve">Check List previo a Sprint </w:t>
+      </w:r>
+      <w:r>
+        <w:rPr>
+          <w:b/>
+          <w:color w:val="000000"/>
+          <w:sz w:val="48"/>
+          <w:szCs w:val="48"/>
+          <w:lang w:val="en-US"/>
+        </w:rPr>
+        <w:t>2</w:t>
       </w:r>
     </w:p>
     <w:p>

</xml_diff>